<commit_message>
QA pass: number consistency (11.3 bps) + memo tone polish
- Replace rounded "11 bps" with the precise 11.3 bps break-even in the memo
  (abstract/cost section/Figure 1 caption) and the interview pitch, so README,
  memo, PDF, and pitch all report identical key numbers.
- Light tone edits to the abstract closer and cost section (less terse/negative,
  lands on the methodology). Rebuilt docx + pdf.
</commit_message>
<xml_diff>
--- a/reports/Equity_StatArb_Memo.docx
+++ b/reports/Equity_StatArb_Memo.docx
@@ -49,7 +49,7 @@
         <w:t xml:space="preserve"> </w:t>
       </w:r>
       <w:r>
-        <w:t xml:space="preserve">I test whether short-horizon cross-sectional reversal in US equities survives a realistic, implementation-aware backtest. Using survivorship-bias-free CRSP daily data (2000–2024) and a deliberately leak-safe pipeline, I build the strategy up in stages — from a raw reversal baseline to a sector-residual signal with turnover control — and stress-test it for transaction costs, capacity, regime dependence, and out-of-sample stability. The signal is genuinely predictive and, after residualization and turnover control, is net-profitable in sample (Sharpe 0.34 after 7 bps costs; break-even cost 11.3 bps). But its edge has decayed steadily over the sample, it is capacity-constrained (~$10–100M), and on a single pre-registered out-of-sample test (2019–2024) it does not survive realistic costs (net Sharpe −0.15 at 7 bps; break-even 4.2 bps). The result is consistent with a crowded, cost-sensitive anomaly that has been largely arbitraged away. The project’s contribution is the disciplined process used to establish that, not a tradable signal.</w:t>
+        <w:t xml:space="preserve">I test whether short-horizon cross-sectional reversal in US equities survives a realistic, implementation-aware backtest. Using survivorship-bias-free CRSP daily data (2000–2024) and a deliberately leak-safe pipeline, I build the strategy up in stages — from a raw reversal baseline to a sector-residual signal with turnover control — and stress-test it for transaction costs, capacity, regime dependence, and out-of-sample stability. The signal is genuinely predictive and, after residualization and turnover control, is net-profitable in sample (Sharpe 0.34 after 7 bps costs; break-even cost 11.3 bps). But its edge has decayed steadily over the sample, it is capacity-constrained (~$10–100M), and on a single pre-registered out-of-sample test (2019–2024) it does not survive realistic costs (net Sharpe −0.15 at 7 bps; break-even 4.2 bps). The result is consistent with a crowded, cost-sensitive anomaly that has been largely arbitraged away, and the value of the work is the end-to-end methodology used to reach that conclusion rigorously.</w:t>
       </w:r>
     </w:p>
     <w:bookmarkStart w:id="9" w:name="research-question"/>
@@ -488,7 +488,7 @@
         <w:pStyle w:val="FirstParagraph"/>
       </w:pPr>
       <w:r>
-        <w:t xml:space="preserve">Because the strategy lives and dies on implementation, the cost and capacity analysis is central rather than an afterthought. Net Sharpe falls roughly linearly with assumed cost, crossing zero near 11 bps (Figure 1).</w:t>
+        <w:t xml:space="preserve">Because the strategy’s viability rests on implementation, the cost and capacity analysis is treated as central rather than an afterthought. Net Sharpe falls roughly linearly with assumed cost, crossing zero near the 11.3 bps break-even (Figure 1).</w:t>
       </w:r>
     </w:p>
     <w:p>
@@ -500,7 +500,7 @@
           <wp:inline>
             <wp:extent cx="5120640" cy="3291840"/>
             <wp:effectExtent b="0" l="0" r="0" t="0"/>
-            <wp:docPr descr="Figure 1. In-sample net Sharpe versus assumed per-turnover cost. Net-positive up to ~11 bps; about 0.08 Sharpe lost per bp." title="" id="16" name="Picture"/>
+            <wp:docPr descr="Figure 1. In-sample net Sharpe versus assumed per-turnover cost. Net-positive up to the ~11.3 bps break-even; about 0.08 Sharpe lost per bp." title="" id="16" name="Picture"/>
             <a:graphic>
               <a:graphicData uri="http://schemas.openxmlformats.org/drawingml/2006/picture">
                 <pic:pic>
@@ -543,7 +543,7 @@
         <w:pStyle w:val="ImageCaption"/>
       </w:pPr>
       <w:r>
-        <w:t xml:space="preserve">Figure 1. In-sample net Sharpe versus assumed per-turnover cost. Net-positive up to ~11 bps; about 0.08 Sharpe lost per bp.</w:t>
+        <w:t xml:space="preserve">Figure 1. In-sample net Sharpe versus assumed per-turnover cost. Net-positive up to the ~11.3 bps break-even; about 0.08 Sharpe lost per bp.</w:t>
       </w:r>
     </w:p>
     <w:p>

</xml_diff>

<commit_message>
memo source-of-truth in repo + study guide + impact refs
- reports/memo.md: the Markdown is now the committed source of truth (portable
  figure paths); regenerate docx/pdf from it via pandoc (command in study guide).
  Prevents drift between Word edits and the repo.
- Add directly-relevant market-impact references (Almgren et al. 2005; Tóth et al.
  2011) alongside Almgren-Chriss 2000; rebuilt docx + pdf.
- reports/study_guide.md: pipeline-first study roadmap (Phase 1 pipeline ->
  Phase 2 core ideas -> Phase 3 selective papers), with the memo-regen workflow.
</commit_message>
<xml_diff>
--- a/reports/Equity_StatArb_Memo.docx
+++ b/reports/Equity_StatArb_Memo.docx
@@ -505,7 +505,7 @@
               <a:graphicData uri="http://schemas.openxmlformats.org/drawingml/2006/picture">
                 <pic:pic>
                   <pic:nvPicPr>
-                    <pic:cNvPr descr="/Users/andrewzhang/Documents/equity-statarb/reports/figures/cost_sensitivity.png" id="17" name="Picture"/>
+                    <pic:cNvPr descr="reports/figures/cost_sensitivity.png" id="17" name="Picture"/>
                     <pic:cNvPicPr>
                       <a:picLocks noChangeArrowheads="1" noChangeAspect="1"/>
                     </pic:cNvPicPr>
@@ -551,7 +551,7 @@
         <w:pStyle w:val="BodyText"/>
       </w:pPr>
       <w:r>
-        <w:t xml:space="preserve">Capacity uses a square-root market-impact model, impact ≈ η·σ·√(trade/ADV), with the coefficient η shown across a plausible range rather than assumed. Usable capacity is modest — roughly $10–100M depending on η (Figure 2). The binding constraint is not average liquidity but a thin-name tail: at $1B of capital the largest single-name participation reaches multiples of daily volume. A position cap at a fraction of ADV controls that tail and limits the damage at scale, but does not extend the profitable frontier; it is a risk control, not a capacity unlock.</w:t>
+        <w:t xml:space="preserve">Capacity uses a square-root market-impact model, impact ≈ η·σ·√(trade/ADV) — a standard practitioner approximation (Almgren et al., 2005; Tóth et al., 2011) — with the coefficient η shown across a plausible range rather than assumed. Usable capacity is modest — roughly $10–100M depending on η (Figure 2). The binding constraint is not average liquidity but a thin-name tail: at $1B of capital the largest single-name participation reaches multiples of daily volume. A position cap at a fraction of ADV controls that tail and limits the damage at scale, but does not extend the profitable frontier; it is a risk control, not a capacity unlock.</w:t>
       </w:r>
     </w:p>
     <w:p>
@@ -568,7 +568,7 @@
               <a:graphicData uri="http://schemas.openxmlformats.org/drawingml/2006/picture">
                 <pic:pic>
                   <pic:nvPicPr>
-                    <pic:cNvPr descr="/Users/andrewzhang/Documents/equity-statarb/reports/figures/capacity.png" id="20" name="Picture"/>
+                    <pic:cNvPr descr="reports/figures/capacity.png" id="20" name="Picture"/>
                     <pic:cNvPicPr>
                       <a:picLocks noChangeArrowheads="1" noChangeAspect="1"/>
                     </pic:cNvPicPr>
@@ -917,7 +917,7 @@
               <a:graphicData uri="http://schemas.openxmlformats.org/drawingml/2006/picture">
                 <pic:pic>
                   <pic:nvPicPr>
-                    <pic:cNvPr descr="/Users/andrewzhang/Documents/equity-statarb/reports/figures/oos_equity.png" id="28" name="Picture"/>
+                    <pic:cNvPr descr="reports/figures/oos_equity.png" id="28" name="Picture"/>
                     <pic:cNvPicPr>
                       <a:picLocks noChangeArrowheads="1" noChangeAspect="1"/>
                     </pic:cNvPicPr>
@@ -1058,6 +1058,27 @@
         <w:pStyle w:val="BodyText"/>
       </w:pPr>
       <w:r>
+        <w:t xml:space="preserve">Almgren, R., Thum, C., Hauptmann, E., and Li, H. (2005). Direct estimation of equity market impact.</w:t>
+      </w:r>
+      <w:r>
+        <w:t xml:space="preserve"> </w:t>
+      </w:r>
+      <w:r>
+        <w:rPr>
+          <w:i/>
+          <w:iCs/>
+        </w:rPr>
+        <w:t xml:space="preserve">Risk</w:t>
+      </w:r>
+      <w:r>
+        <w:t xml:space="preserve">.</w:t>
+      </w:r>
+    </w:p>
+    <w:p>
+      <w:pPr>
+        <w:pStyle w:val="BodyText"/>
+      </w:pPr>
+      <w:r>
         <w:t xml:space="preserve">Avellaneda, M., and Lee, J. (2010). Statistical arbitrage in the US equities market.</w:t>
       </w:r>
       <w:r>
@@ -1195,6 +1216,27 @@
           <w:iCs/>
         </w:rPr>
         <w:t xml:space="preserve">Journal of Finance</w:t>
+      </w:r>
+      <w:r>
+        <w:t xml:space="preserve">.</w:t>
+      </w:r>
+    </w:p>
+    <w:p>
+      <w:pPr>
+        <w:pStyle w:val="BodyText"/>
+      </w:pPr>
+      <w:r>
+        <w:t xml:space="preserve">Tóth, B., et al. (2011). Anomalous price impact and the critical nature of liquidity in financial markets.</w:t>
+      </w:r>
+      <w:r>
+        <w:t xml:space="preserve"> </w:t>
+      </w:r>
+      <w:r>
+        <w:rPr>
+          <w:i/>
+          <w:iCs/>
+        </w:rPr>
+        <w:t xml:space="preserve">Physical Review X</w:t>
       </w:r>
       <w:r>
         <w:t xml:space="preserve">.</w:t>

</xml_diff>

<commit_message>
memo: reformat to academic (Computer Modern) house style
Match the supplied reference paper's typesetting:
- pandoc -> xelatex, 12pt Computer Modern, 1.25in margins (settings in memo.md YAML).
- Centered title/author/"This draft" block + standard abstract environment.
- Numbered bold sections; booktabs tables with captions above.
- Inline math set properly (eta, sigma, sqrt, >=, +/-) in CM math.
- Bibliography reformatted to econ author-year style with hanging indent.
- Build command simplified (styling now in YAML); study_guide updated.
Note: figure captions render below (floatrow for caption-above not available on TinyTeX).
</commit_message>
<xml_diff>
--- a/reports/Equity_StatArb_Memo.docx
+++ b/reports/Equity_StatArb_Memo.docx
@@ -23,7 +23,7 @@
         <w:pStyle w:val="Author"/>
       </w:pPr>
       <w:r>
-        <w:t xml:space="preserve">Andrew Zhang · Research memo</w:t>
+        <w:t xml:space="preserve">Andrew Zhang</w:t>
       </w:r>
     </w:p>
     <w:p>
@@ -31,34 +31,32 @@
         <w:pStyle w:val="Date"/>
       </w:pPr>
       <w:r>
-        <w:t xml:space="preserve">June 2026</w:t>
-      </w:r>
-    </w:p>
-    <w:p>
-      <w:pPr>
-        <w:pStyle w:val="FirstParagraph"/>
-      </w:pPr>
-      <w:r>
-        <w:rPr>
-          <w:b/>
-          <w:bCs/>
-        </w:rPr>
-        <w:t xml:space="preserve">Abstract.</w:t>
-      </w:r>
-      <w:r>
-        <w:t xml:space="preserve"> </w:t>
-      </w:r>
-      <w:r>
-        <w:t xml:space="preserve">I test whether short-horizon cross-sectional reversal in US equities survives a realistic, implementation-aware backtest. Using survivorship-bias-free CRSP daily data (2000–2024) and a deliberately leak-safe pipeline, I build the strategy up in stages — from a raw reversal baseline to a sector-residual signal with turnover control — and stress-test it for transaction costs, capacity, regime dependence, and out-of-sample stability. The signal is genuinely predictive and, after residualization and turnover control, is net-profitable in sample (Sharpe 0.34 after 7 bps costs; break-even cost 11.3 bps). But its edge has decayed steadily over the sample, it is capacity-constrained (~$10–100M), and on a single pre-registered out-of-sample test (2019–2024) it does not survive realistic costs (net Sharpe −0.15 at 7 bps; break-even 4.2 bps). The result is consistent with a crowded, cost-sensitive anomaly that has been largely arbitraged away, and the value of the work is the end-to-end methodology used to reach that conclusion rigorously.</w:t>
+        <w:t xml:space="preserve">This draft: June 29, 2026</w:t>
+      </w:r>
+    </w:p>
+    <w:p>
+      <w:pPr>
+        <w:pStyle w:val="AbstractTitle"/>
+      </w:pPr>
+      <w:r>
+        <w:t xml:space="preserve">Abstract</w:t>
+      </w:r>
+    </w:p>
+    <w:p>
+      <w:pPr>
+        <w:pStyle w:val="Abstract"/>
+      </w:pPr>
+      <w:r>
+        <w:t xml:space="preserve">I test whether short-horizon cross-sectional reversal in US equities survives a realistic, implementation-aware backtest. Using survivorship-bias-free CRSP daily data (2000–2024) and a deliberately leak-safe pipeline, I build the strategy up in stages — from a raw reversal baseline to a sector-residual signal with turnover control — and stress-test it for transaction costs, capacity, regime dependence, and out-of-sample stability. The signal is genuinely predictive and, after residualization and turnover control, is net-profitable in sample (Sharpe 0.34 after 7 bps costs; break-even cost 11.3 bps). But its edge has decayed steadily over the sample, it is capacity-constrained (roughly $10–100M), and on a single pre-registered out-of-sample test (2019–2024) it does not survive realistic costs (net Sharpe -0.15 at 7 bps; break-even 4.2 bps). The result is consistent with a crowded, cost-sensitive anomaly that has been largely arbitraged away, and the value of the work is the end-to-end methodology used to reach that conclusion rigorously.</w:t>
       </w:r>
     </w:p>
     <w:bookmarkStart w:id="9" w:name="research-question"/>
     <w:p>
       <w:pPr>
-        <w:pStyle w:val="Heading2"/>
-      </w:pPr>
-      <w:r>
-        <w:t xml:space="preserve">1. Research question</w:t>
+        <w:pStyle w:val="Heading1"/>
+      </w:pPr>
+      <w:r>
+        <w:t xml:space="preserve">1 Research question</w:t>
       </w:r>
     </w:p>
     <w:p>
@@ -73,10 +71,10 @@
     <w:bookmarkStart w:id="10" w:name="data-and-look-ahead-discipline"/>
     <w:p>
       <w:pPr>
-        <w:pStyle w:val="Heading2"/>
-      </w:pPr>
-      <w:r>
-        <w:t xml:space="preserve">2. Data and look-ahead discipline</w:t>
+        <w:pStyle w:val="Heading1"/>
+      </w:pPr>
+      <w:r>
+        <w:t xml:space="preserve">2 Data and look-ahead discipline</w:t>
       </w:r>
     </w:p>
     <w:p>
@@ -106,7 +104,7 @@
         <w:t xml:space="preserve"> </w:t>
       </w:r>
       <w:r>
-        <w:t xml:space="preserve">44.5% of delisting events have a missing return in CRSP. Following Shumway (1997), missing returns on performance-related delistings are set to −30% rather than zero, so failed names are not quietly recorded as flat exits.</w:t>
+        <w:t xml:space="preserve">44.5% of delisting events have a missing return in CRSP. Following Shumway (1997), missing returns on performance-related delistings are set to -30% rather than zero, so failed names are not quietly recorded as flat exits.</w:t>
       </w:r>
     </w:p>
     <w:p>
@@ -128,7 +126,24 @@
         <w:t xml:space="preserve"> </w:t>
       </w:r>
       <w:r>
-        <w:t xml:space="preserve">The backtest keeps two distinct panels: a realized-return panel (never masked) for computing PnL, and a lagged eligibility mask (top-1,000 by trailing dollar volume, prior-close price ≥ $5, delisting rows excluded) that only governs which names may receive new weight. This prevents the most common silent leak, in which a position that becomes ineligible disappears from PnL instead of realizing its loss.</w:t>
+        <w:t xml:space="preserve">The backtest keeps two distinct panels: a realized-return panel (never masked) for computing PnL, and a lagged eligibility mask (top-1,000 by trailing dollar volume, prior-close price</w:t>
+      </w:r>
+      <w:r>
+        <w:t xml:space="preserve"> </w:t>
+      </w:r>
+      <m:oMath>
+        <m:r>
+          <m:rPr>
+            <m:sty m:val="p"/>
+          </m:rPr>
+          <m:t>≥</m:t>
+        </m:r>
+      </m:oMath>
+      <w:r>
+        <w:t xml:space="preserve"> </w:t>
+      </w:r>
+      <w:r>
+        <w:t xml:space="preserve">$5, delisting rows excluded) that only governs which names may receive new weight. This prevents the most common silent leak, in which a position that becomes ineligible disappears from PnL instead of realizing its loss.</w:t>
       </w:r>
     </w:p>
     <w:p>
@@ -143,18 +158,18 @@
     <w:bookmarkStart w:id="13" w:name="methodology"/>
     <w:p>
       <w:pPr>
+        <w:pStyle w:val="Heading1"/>
+      </w:pPr>
+      <w:r>
+        <w:t xml:space="preserve">3 Methodology</w:t>
+      </w:r>
+    </w:p>
+    <w:bookmarkStart w:id="11" w:name="signal-construction"/>
+    <w:p>
+      <w:pPr>
         <w:pStyle w:val="Heading2"/>
       </w:pPr>
       <w:r>
-        <w:t xml:space="preserve">3. Methodology</w:t>
-      </w:r>
-    </w:p>
-    <w:bookmarkStart w:id="11" w:name="signal-construction"/>
-    <w:p>
-      <w:pPr>
-        <w:pStyle w:val="Heading3"/>
-      </w:pPr>
-      <w:r>
         <w:t xml:space="preserve">3.1 Signal construction</w:t>
       </w:r>
     </w:p>
@@ -163,14 +178,17 @@
         <w:pStyle w:val="FirstParagraph"/>
       </w:pPr>
       <w:r>
-        <w:t xml:space="preserve">The base signal is the negative of each name’s trailing five-day return, winsorized at ±20% for signal formation only (never for realized PnL). I then remove common variation before measuring reversal, in two escalating steps: a market residual (rolling beta to the equal-weighted eligible universe), and a leave-one-out sector residual (demeaning within two-digit SIC industry against eligible peers, excluding the name itself so it cannot anchor its own benchmark). Residualizing targets idiosyncratic reversal rather than sector or market co-movement.</w:t>
+        <w:t xml:space="preserve">The base signal is the negative of each name’s trailing five-day return, winsorized at $</w:t>
+      </w:r>
+      <w:r>
+        <w:t xml:space="preserve">$20% for signal formation only (never for realized PnL). I then remove common variation before measuring reversal, in two escalating steps: a market residual (rolling beta to the equal-weighted eligible universe), and a leave-one-out sector residual (demeaning within two-digit SIC industry against eligible peers, excluding the name itself so it cannot anchor its own benchmark). Residualizing targets idiosyncratic reversal rather than sector or market co-movement.</w:t>
       </w:r>
     </w:p>
     <w:bookmarkEnd w:id="11"/>
     <w:bookmarkStart w:id="12" w:name="portfolio-and-turnover-control"/>
     <w:p>
       <w:pPr>
-        <w:pStyle w:val="Heading3"/>
+        <w:pStyle w:val="Heading2"/>
       </w:pPr>
       <w:r>
         <w:t xml:space="preserve">3.2 Portfolio and turnover control</w:t>
@@ -189,10 +207,10 @@
     <w:bookmarkStart w:id="14" w:name="in-sample-results-20002018"/>
     <w:p>
       <w:pPr>
-        <w:pStyle w:val="Heading2"/>
-      </w:pPr>
-      <w:r>
-        <w:t xml:space="preserve">4. In-sample results (2000–2018)</w:t>
+        <w:pStyle w:val="Heading1"/>
+      </w:pPr>
+      <w:r>
+        <w:t xml:space="preserve">4 In-sample results (2000–2018)</w:t>
       </w:r>
     </w:p>
     <w:p>
@@ -200,7 +218,25 @@
         <w:pStyle w:val="FirstParagraph"/>
       </w:pPr>
       <w:r>
-        <w:t xml:space="preserve">Each layer of construction raises the per-trade edge, summarized by the break-even cost (the cost per unit turnover at which net return is zero):</w:t>
+        <w:t xml:space="preserve">Each layer of construction raises the per-trade edge, summarized by the break-even cost (the cost per unit turnover at which net return is zero).</w:t>
+      </w:r>
+    </w:p>
+    <w:p>
+      <w:pPr>
+        <w:pStyle w:val="BodyText"/>
+      </w:pPr>
+      <w:r>
+        <w:rPr>
+          <w:b/>
+          <w:bCs/>
+        </w:rPr>
+        <w:t xml:space="preserve">Table 1.</w:t>
+      </w:r>
+      <w:r>
+        <w:t xml:space="preserve"> </w:t>
+      </w:r>
+      <w:r>
+        <w:t xml:space="preserve">Construction ladder, in-sample 2000–2018.</w:t>
       </w:r>
     </w:p>
     <w:tbl>
@@ -477,10 +513,10 @@
     <w:bookmarkStart w:id="21" w:name="execution-costs-and-capacity"/>
     <w:p>
       <w:pPr>
-        <w:pStyle w:val="Heading2"/>
-      </w:pPr>
-      <w:r>
-        <w:t xml:space="preserve">5. Execution: costs and capacity</w:t>
+        <w:pStyle w:val="Heading1"/>
+      </w:pPr>
+      <w:r>
+        <w:t xml:space="preserve">5 Execution: costs and capacity</w:t>
       </w:r>
     </w:p>
     <w:p>
@@ -498,9 +534,9 @@
       <w:r>
         <w:drawing>
           <wp:inline>
-            <wp:extent cx="5120640" cy="3291840"/>
+            <wp:extent cx="4937760" cy="3174274"/>
             <wp:effectExtent b="0" l="0" r="0" t="0"/>
-            <wp:docPr descr="Figure 1. In-sample net Sharpe versus assumed per-turnover cost. Net-positive up to the ~11.3 bps break-even; about 0.08 Sharpe lost per bp." title="" id="16" name="Picture"/>
+            <wp:docPr descr="In-sample net Sharpe versus assumed per-turnover cost. Net-positive up to the ~11.3 bps break-even; about 0.08 Sharpe lost per bp." title="" id="16" name="Picture"/>
             <a:graphic>
               <a:graphicData uri="http://schemas.openxmlformats.org/drawingml/2006/picture">
                 <pic:pic>
@@ -519,7 +555,7 @@
                   <pic:spPr bwMode="auto">
                     <a:xfrm>
                       <a:off x="0" y="0"/>
-                      <a:ext cx="5120640" cy="3291840"/>
+                      <a:ext cx="4937760" cy="3174274"/>
                     </a:xfrm>
                     <a:prstGeom prst="rect">
                       <a:avLst/>
@@ -543,7 +579,7 @@
         <w:pStyle w:val="ImageCaption"/>
       </w:pPr>
       <w:r>
-        <w:t xml:space="preserve">Figure 1. In-sample net Sharpe versus assumed per-turnover cost. Net-positive up to the ~11.3 bps break-even; about 0.08 Sharpe lost per bp.</w:t>
+        <w:t xml:space="preserve">In-sample net Sharpe versus assumed per-turnover cost. Net-positive up to the ~11.3 bps break-even; about 0.08 Sharpe lost per bp.</w:t>
       </w:r>
     </w:p>
     <w:p>
@@ -551,7 +587,105 @@
         <w:pStyle w:val="BodyText"/>
       </w:pPr>
       <w:r>
-        <w:t xml:space="preserve">Capacity uses a square-root market-impact model, impact ≈ η·σ·√(trade/ADV) — a standard practitioner approximation (Almgren et al., 2005; Tóth et al., 2011) — with the coefficient η shown across a plausible range rather than assumed. Usable capacity is modest — roughly $10–100M depending on η (Figure 2). The binding constraint is not average liquidity but a thin-name tail: at $1B of capital the largest single-name participation reaches multiples of daily volume. A position cap at a fraction of ADV controls that tail and limits the damage at scale, but does not extend the profitable frontier; it is a risk control, not a capacity unlock.</w:t>
+        <w:t xml:space="preserve">Capacity uses a square-root market-impact model,</w:t>
+      </w:r>
+      <w:r>
+        <w:t xml:space="preserve"> </w:t>
+      </w:r>
+      <m:oMath>
+        <m:r>
+          <m:rPr>
+            <m:nor/>
+            <m:sty m:val="p"/>
+          </m:rPr>
+          <m:t>impact</m:t>
+        </m:r>
+        <m:r>
+          <m:rPr>
+            <m:sty m:val="p"/>
+          </m:rPr>
+          <m:t>≈</m:t>
+        </m:r>
+        <m:r>
+          <m:t>η</m:t>
+        </m:r>
+        <m:r>
+          <m:rPr>
+            <m:sty m:val="p"/>
+          </m:rPr>
+          <m:t>⋅</m:t>
+        </m:r>
+        <m:r>
+          <m:t>σ</m:t>
+        </m:r>
+        <m:r>
+          <m:rPr>
+            <m:sty m:val="p"/>
+          </m:rPr>
+          <m:t>⋅</m:t>
+        </m:r>
+        <m:rad>
+          <m:radPr>
+            <m:degHide m:val="on"/>
+          </m:radPr>
+          <m:deg/>
+          <m:e>
+            <m:r>
+              <m:rPr>
+                <m:nor/>
+                <m:sty m:val="p"/>
+              </m:rPr>
+              <m:t>trade</m:t>
+            </m:r>
+            <m:r>
+              <m:rPr>
+                <m:sty m:val="p"/>
+              </m:rPr>
+              <m:t>/</m:t>
+            </m:r>
+            <m:r>
+              <m:rPr>
+                <m:nor/>
+                <m:sty m:val="p"/>
+              </m:rPr>
+              <m:t>ADV</m:t>
+            </m:r>
+          </m:e>
+        </m:rad>
+      </m:oMath>
+      <w:r>
+        <w:t xml:space="preserve"> </w:t>
+      </w:r>
+      <w:r>
+        <w:t xml:space="preserve">— a standard practitioner approximation (Almgren et al., 2005; Tóth et al., 2011) — with the coefficient</w:t>
+      </w:r>
+      <w:r>
+        <w:t xml:space="preserve"> </w:t>
+      </w:r>
+      <m:oMath>
+        <m:r>
+          <m:t>η</m:t>
+        </m:r>
+      </m:oMath>
+      <w:r>
+        <w:t xml:space="preserve"> </w:t>
+      </w:r>
+      <w:r>
+        <w:t xml:space="preserve">shown across a plausible range rather than assumed. Usable capacity is modest, roughly $10–100M depending on</w:t>
+      </w:r>
+      <w:r>
+        <w:t xml:space="preserve"> </w:t>
+      </w:r>
+      <m:oMath>
+        <m:r>
+          <m:t>η</m:t>
+        </m:r>
+      </m:oMath>
+      <w:r>
+        <w:t xml:space="preserve"> </w:t>
+      </w:r>
+      <w:r>
+        <w:t xml:space="preserve">(Figure 2). The binding constraint is not average liquidity but a thin-name tail: at $1B of capital the largest single-name participation reaches multiples of daily volume. A position cap at a fraction of ADV controls that tail and limits the damage at scale, but does not extend the profitable frontier; it is a risk control, not a capacity unlock.</w:t>
       </w:r>
     </w:p>
     <w:p>
@@ -561,9 +695,9 @@
       <w:r>
         <w:drawing>
           <wp:inline>
-            <wp:extent cx="5120640" cy="3291840"/>
+            <wp:extent cx="4937760" cy="3174274"/>
             <wp:effectExtent b="0" l="0" r="0" t="0"/>
-            <wp:docPr descr="Figure 2. Capacity: net Sharpe versus deployed AUM under square-root impact, for three impact coefficients." title="" id="19" name="Picture"/>
+            <wp:docPr descr="Capacity: net Sharpe versus deployed AUM under square-root impact, for three impact coefficients." title="" id="19" name="Picture"/>
             <a:graphic>
               <a:graphicData uri="http://schemas.openxmlformats.org/drawingml/2006/picture">
                 <pic:pic>
@@ -582,7 +716,7 @@
                   <pic:spPr bwMode="auto">
                     <a:xfrm>
                       <a:off x="0" y="0"/>
-                      <a:ext cx="5120640" cy="3291840"/>
+                      <a:ext cx="4937760" cy="3174274"/>
                     </a:xfrm>
                     <a:prstGeom prst="rect">
                       <a:avLst/>
@@ -606,23 +740,23 @@
         <w:pStyle w:val="ImageCaption"/>
       </w:pPr>
       <w:r>
-        <w:t xml:space="preserve">Figure 2. Capacity: net Sharpe versus deployed AUM under square-root impact, for three impact coefficients.</w:t>
+        <w:t xml:space="preserve">Capacity: net Sharpe versus deployed AUM under square-root impact, for three impact coefficients.</w:t>
       </w:r>
     </w:p>
     <w:bookmarkEnd w:id="21"/>
     <w:bookmarkStart w:id="25" w:name="diagnostics"/>
     <w:p>
       <w:pPr>
+        <w:pStyle w:val="Heading1"/>
+      </w:pPr>
+      <w:r>
+        <w:t xml:space="preserve">6 Diagnostics</w:t>
+      </w:r>
+    </w:p>
+    <w:bookmarkStart w:id="22" w:name="the-edge-has-decayed"/>
+    <w:p>
+      <w:pPr>
         <w:pStyle w:val="Heading2"/>
-      </w:pPr>
-      <w:r>
-        <w:t xml:space="preserve">6. Diagnostics</w:t>
-      </w:r>
-    </w:p>
-    <w:bookmarkStart w:id="22" w:name="the-edge-has-decayed"/>
-    <w:p>
-      <w:pPr>
-        <w:pStyle w:val="Heading3"/>
       </w:pPr>
       <w:r>
         <w:t xml:space="preserve">6.1 The edge has decayed</w:t>
@@ -640,7 +774,7 @@
     <w:bookmarkStart w:id="23" w:name="X42c534364fef33f3c0b8721d39158761406c431"/>
     <w:p>
       <w:pPr>
-        <w:pStyle w:val="Heading3"/>
+        <w:pStyle w:val="Heading2"/>
       </w:pPr>
       <w:r>
         <w:t xml:space="preserve">6.2 Where the alpha is, and what it costs to harvest</w:t>
@@ -658,7 +792,7 @@
     <w:bookmarkStart w:id="24" w:name="risk-character"/>
     <w:p>
       <w:pPr>
-        <w:pStyle w:val="Heading3"/>
+        <w:pStyle w:val="Heading2"/>
       </w:pPr>
       <w:r>
         <w:t xml:space="preserve">6.3 Risk character</w:t>
@@ -677,10 +811,10 @@
     <w:bookmarkStart w:id="29" w:name="out-of-sample-test-20192024"/>
     <w:p>
       <w:pPr>
-        <w:pStyle w:val="Heading2"/>
-      </w:pPr>
-      <w:r>
-        <w:t xml:space="preserve">7. Out-of-sample test (2019–2024)</w:t>
+        <w:pStyle w:val="Heading1"/>
+      </w:pPr>
+      <w:r>
+        <w:t xml:space="preserve">7 Out-of-sample test (2019–2024)</w:t>
       </w:r>
     </w:p>
     <w:p>
@@ -689,6 +823,24 @@
       </w:pPr>
       <w:r>
         <w:t xml:space="preserve">The frozen candidate was evaluated once on the sealed 2019–2024 period, with no parameters chosen after looking. The edge does not survive (Table 2, Figure 3).</w:t>
+      </w:r>
+    </w:p>
+    <w:p>
+      <w:pPr>
+        <w:pStyle w:val="BodyText"/>
+      </w:pPr>
+      <w:r>
+        <w:rPr>
+          <w:b/>
+          <w:bCs/>
+        </w:rPr>
+        <w:t xml:space="preserve">Table 2.</w:t>
+      </w:r>
+      <w:r>
+        <w:t xml:space="preserve"> </w:t>
+      </w:r>
+      <w:r>
+        <w:t xml:space="preserve">In-sample versus out-of-sample summary.</w:t>
       </w:r>
     </w:p>
     <w:tbl>
@@ -828,7 +980,7 @@
               <w:jc w:val="center"/>
             </w:pPr>
             <w:r>
-              <w:t xml:space="preserve">−14.0%</w:t>
+              <w:t xml:space="preserve">-14.0%</w:t>
             </w:r>
           </w:p>
         </w:tc>
@@ -865,7 +1017,7 @@
               <w:jc w:val="center"/>
             </w:pPr>
             <w:r>
-              <w:t xml:space="preserve">−0.15</w:t>
+              <w:t xml:space="preserve">-0.15</w:t>
             </w:r>
           </w:p>
         </w:tc>
@@ -889,7 +1041,7 @@
               <w:jc w:val="center"/>
             </w:pPr>
             <w:r>
-              <w:t xml:space="preserve">−23.1%</w:t>
+              <w:t xml:space="preserve">-23.1%</w:t>
             </w:r>
           </w:p>
         </w:tc>
@@ -910,9 +1062,9 @@
       <w:r>
         <w:drawing>
           <wp:inline>
-            <wp:extent cx="5334000" cy="3000375"/>
+            <wp:extent cx="5303520" cy="2983230"/>
             <wp:effectExtent b="0" l="0" r="0" t="0"/>
-            <wp:docPr descr="Figure 3. Net equity (log scale, 7 bps), in-sample then out-of-sample. Strong early gains, a long plateau through the decay, and an out-of-sample decline." title="" id="27" name="Picture"/>
+            <wp:docPr descr="Net equity (log scale, 7 bps), in-sample then out-of-sample. Strong early gains, a long plateau through the decay, and an out-of-sample decline." title="" id="27" name="Picture"/>
             <a:graphic>
               <a:graphicData uri="http://schemas.openxmlformats.org/drawingml/2006/picture">
                 <pic:pic>
@@ -931,7 +1083,7 @@
                   <pic:spPr bwMode="auto">
                     <a:xfrm>
                       <a:off x="0" y="0"/>
-                      <a:ext cx="5334000" cy="3000375"/>
+                      <a:ext cx="5303520" cy="2983230"/>
                     </a:xfrm>
                     <a:prstGeom prst="rect">
                       <a:avLst/>
@@ -955,34 +1107,34 @@
         <w:pStyle w:val="ImageCaption"/>
       </w:pPr>
       <w:r>
-        <w:t xml:space="preserve">Figure 3. Net equity (log scale, 7 bps), in-sample then out-of-sample. Strong early gains, a long plateau through the decay, and an out-of-sample decline.</w:t>
+        <w:t xml:space="preserve">Net equity (log scale, 7 bps), in-sample then out-of-sample. Strong early gains, a long plateau through the decay, and an out-of-sample decline.</w:t>
       </w:r>
     </w:p>
     <w:bookmarkEnd w:id="29"/>
     <w:bookmarkStart w:id="31" w:name="conclusion"/>
     <w:p>
       <w:pPr>
+        <w:pStyle w:val="Heading1"/>
+      </w:pPr>
+      <w:r>
+        <w:t xml:space="preserve">8 Conclusion</w:t>
+      </w:r>
+    </w:p>
+    <w:p>
+      <w:pPr>
+        <w:pStyle w:val="FirstParagraph"/>
+      </w:pPr>
+      <w:r>
+        <w:t xml:space="preserve">Short-horizon residual reversal was a strong, real effect in the early 2000s that has decayed below tradable levels: by the out-of-sample period it no longer clears realistic costs, its capacity is small, and its remaining alpha sits on the expensive-to-borrow short side. This is the expected life cycle of a well-known, crowded anomaly. The deliverable is the method — a leak-safe pipeline, a transparent construction ladder, an execution and capacity layer, regime and attribution diagnostics, a pre-registered specification, and a single honest out-of-sample test — which is what makes the negative conclusion trustworthy.</w:t>
+      </w:r>
+    </w:p>
+    <w:bookmarkStart w:id="30" w:name="limitations-and-future-work"/>
+    <w:p>
+      <w:pPr>
         <w:pStyle w:val="Heading2"/>
       </w:pPr>
       <w:r>
-        <w:t xml:space="preserve">8. Conclusion</w:t>
-      </w:r>
-    </w:p>
-    <w:p>
-      <w:pPr>
-        <w:pStyle w:val="FirstParagraph"/>
-      </w:pPr>
-      <w:r>
-        <w:t xml:space="preserve">Short-horizon residual reversal was a strong, real effect in the early 2000s that has decayed below tradable levels: by the out-of-sample period it no longer clears realistic costs, its capacity is small, and its remaining alpha sits on the expensive-to-borrow short side. This is the expected life cycle of a well-known, crowded anomaly. The deliverable is the method — a leak-safe pipeline, a transparent construction ladder, an execution and capacity layer, regime and attribution diagnostics, a pre-registered specification, and a single honest out-of-sample test — which is what makes the negative conclusion trustworthy.</w:t>
-      </w:r>
-    </w:p>
-    <w:bookmarkStart w:id="30" w:name="limitations-and-future-work"/>
-    <w:p>
-      <w:pPr>
-        <w:pStyle w:val="Heading3"/>
-      </w:pPr>
-      <w:r>
-        <w:t xml:space="preserve">Limitations and future work</w:t>
+        <w:t xml:space="preserve">8.1 Limitations and future work</w:t>
       </w:r>
     </w:p>
     <w:p>
@@ -1026,7 +1178,7 @@
     <w:bookmarkStart w:id="32" w:name="references"/>
     <w:p>
       <w:pPr>
-        <w:pStyle w:val="Heading2"/>
+        <w:pStyle w:val="Heading1"/>
       </w:pPr>
       <w:r>
         <w:t xml:space="preserve">References</w:t>
@@ -1037,7 +1189,13 @@
         <w:pStyle w:val="FirstParagraph"/>
       </w:pPr>
       <w:r>
-        <w:t xml:space="preserve">Almgren, R., and Chriss, N. (2000). Optimal execution of portfolio transactions.</w:t>
+        <w:t xml:space="preserve">Almgren, R. and N. Chriss (2000),</w:t>
+      </w:r>
+      <w:r>
+        <w:t xml:space="preserve"> </w:t>
+      </w:r>
+      <w:r>
+        <w:t xml:space="preserve">“Optimal Execution of Portfolio Transactions,”</w:t>
       </w:r>
       <w:r>
         <w:t xml:space="preserve"> </w:t>
@@ -1058,7 +1216,13 @@
         <w:pStyle w:val="BodyText"/>
       </w:pPr>
       <w:r>
-        <w:t xml:space="preserve">Almgren, R., Thum, C., Hauptmann, E., and Li, H. (2005). Direct estimation of equity market impact.</w:t>
+        <w:t xml:space="preserve">Almgren, R., C. Thum, E. Hauptmann, and H. Li (2005),</w:t>
+      </w:r>
+      <w:r>
+        <w:t xml:space="preserve"> </w:t>
+      </w:r>
+      <w:r>
+        <w:t xml:space="preserve">“Direct Estimation of Equity Market Impact,”</w:t>
       </w:r>
       <w:r>
         <w:t xml:space="preserve"> </w:t>
@@ -1079,7 +1243,13 @@
         <w:pStyle w:val="BodyText"/>
       </w:pPr>
       <w:r>
-        <w:t xml:space="preserve">Avellaneda, M., and Lee, J. (2010). Statistical arbitrage in the US equities market.</w:t>
+        <w:t xml:space="preserve">Avellaneda, M. and J. Lee (2010),</w:t>
+      </w:r>
+      <w:r>
+        <w:t xml:space="preserve"> </w:t>
+      </w:r>
+      <w:r>
+        <w:t xml:space="preserve">“Statistical Arbitrage in the US Equities Market,”</w:t>
       </w:r>
       <w:r>
         <w:t xml:space="preserve"> </w:t>
@@ -1100,7 +1270,13 @@
         <w:pStyle w:val="BodyText"/>
       </w:pPr>
       <w:r>
-        <w:t xml:space="preserve">Bailey, D., and López de Prado, M. (2014). The deflated Sharpe ratio.</w:t>
+        <w:t xml:space="preserve">Bailey, D. and M. López de Prado (2014),</w:t>
+      </w:r>
+      <w:r>
+        <w:t xml:space="preserve"> </w:t>
+      </w:r>
+      <w:r>
+        <w:t xml:space="preserve">“The Deflated Sharpe Ratio,”</w:t>
       </w:r>
       <w:r>
         <w:t xml:space="preserve"> </w:t>
@@ -1121,7 +1297,13 @@
         <w:pStyle w:val="BodyText"/>
       </w:pPr>
       <w:r>
-        <w:t xml:space="preserve">Harvey, C., Liu, Y., and Zhu, H. (2016). … and the cross-section of expected returns.</w:t>
+        <w:t xml:space="preserve">Harvey, C.R., Y. Liu, and H. Zhu (2016),</w:t>
+      </w:r>
+      <w:r>
+        <w:t xml:space="preserve"> </w:t>
+      </w:r>
+      <w:r>
+        <w:t xml:space="preserve">“… and the Cross-Section of Expected Returns,”</w:t>
       </w:r>
       <w:r>
         <w:t xml:space="preserve"> </w:t>
@@ -1142,7 +1324,13 @@
         <w:pStyle w:val="BodyText"/>
       </w:pPr>
       <w:r>
-        <w:t xml:space="preserve">Jegadeesh, N., and Titman, S. (1993). Returns to buying winners and selling losers.</w:t>
+        <w:t xml:space="preserve">Jegadeesh, N. and S. Titman (1993),</w:t>
+      </w:r>
+      <w:r>
+        <w:t xml:space="preserve"> </w:t>
+      </w:r>
+      <w:r>
+        <w:t xml:space="preserve">“Returns to Buying Winners and Selling Losers,”</w:t>
       </w:r>
       <w:r>
         <w:t xml:space="preserve"> </w:t>
@@ -1163,7 +1351,13 @@
         <w:pStyle w:val="BodyText"/>
       </w:pPr>
       <w:r>
-        <w:t xml:space="preserve">Lehmann, B. (1990). Fads, martingales, and market efficiency.</w:t>
+        <w:t xml:space="preserve">Lehmann, B.N. (1990),</w:t>
+      </w:r>
+      <w:r>
+        <w:t xml:space="preserve"> </w:t>
+      </w:r>
+      <w:r>
+        <w:t xml:space="preserve">“Fads, Martingales, and Market Efficiency,”</w:t>
       </w:r>
       <w:r>
         <w:t xml:space="preserve"> </w:t>
@@ -1184,7 +1378,13 @@
         <w:pStyle w:val="BodyText"/>
       </w:pPr>
       <w:r>
-        <w:t xml:space="preserve">Lo, A., and MacKinlay, A. C. (1990). When are contrarian profits due to stock market overreaction?</w:t>
+        <w:t xml:space="preserve">Lo, A.W. and A.C. MacKinlay (1990),</w:t>
+      </w:r>
+      <w:r>
+        <w:t xml:space="preserve"> </w:t>
+      </w:r>
+      <w:r>
+        <w:t xml:space="preserve">“When Are Contrarian Profits Due to Stock Market Overreaction?”</w:t>
       </w:r>
       <w:r>
         <w:t xml:space="preserve"> </w:t>
@@ -1205,7 +1405,13 @@
         <w:pStyle w:val="BodyText"/>
       </w:pPr>
       <w:r>
-        <w:t xml:space="preserve">Shumway, T. (1997). The delisting bias in CRSP data.</w:t>
+        <w:t xml:space="preserve">Shumway, T. (1997),</w:t>
+      </w:r>
+      <w:r>
+        <w:t xml:space="preserve"> </w:t>
+      </w:r>
+      <w:r>
+        <w:t xml:space="preserve">“The Delisting Bias in CRSP Data,”</w:t>
       </w:r>
       <w:r>
         <w:t xml:space="preserve"> </w:t>
@@ -1226,7 +1432,13 @@
         <w:pStyle w:val="BodyText"/>
       </w:pPr>
       <w:r>
-        <w:t xml:space="preserve">Tóth, B., et al. (2011). Anomalous price impact and the critical nature of liquidity in financial markets.</w:t>
+        <w:t xml:space="preserve">Tóth, B., et al. (2011),</w:t>
+      </w:r>
+      <w:r>
+        <w:t xml:space="preserve"> </w:t>
+      </w:r>
+      <w:r>
+        <w:t xml:space="preserve">“Anomalous Price Impact and the Critical Nature of Liquidity in Financial Markets,”</w:t>
       </w:r>
       <w:r>
         <w:t xml:space="preserve"> </w:t>

</xml_diff>

<commit_message>
memo figures: serif / CM-math plot style to match the paper
- src/plotstyle.py: shared rcParams (serif fonts, mathtext cm, smaller labels,
  no top/right spines); applied in the cost/capacity/OOS figure scripts.
- Regenerated cost_sensitivity, capacity, oos_equity figures; rebuilt memo
  docx + pdf to embed them. Numbers unchanged (deterministic): deflated Sharpe
  0.20, OOS net -0.15, etc.
</commit_message>
<xml_diff>
--- a/reports/Equity_StatArb_Memo.docx
+++ b/reports/Equity_StatArb_Memo.docx
@@ -534,7 +534,7 @@
       <w:r>
         <w:drawing>
           <wp:inline>
-            <wp:extent cx="4937760" cy="3174274"/>
+            <wp:extent cx="4937760" cy="3144918"/>
             <wp:effectExtent b="0" l="0" r="0" t="0"/>
             <wp:docPr descr="In-sample net Sharpe versus assumed per-turnover cost. Net-positive up to the ~11.3 bps break-even; about 0.08 Sharpe lost per bp." title="" id="16" name="Picture"/>
             <a:graphic>
@@ -555,7 +555,7 @@
                   <pic:spPr bwMode="auto">
                     <a:xfrm>
                       <a:off x="0" y="0"/>
-                      <a:ext cx="4937760" cy="3174274"/>
+                      <a:ext cx="4937760" cy="3144918"/>
                     </a:xfrm>
                     <a:prstGeom prst="rect">
                       <a:avLst/>
@@ -695,7 +695,7 @@
       <w:r>
         <w:drawing>
           <wp:inline>
-            <wp:extent cx="4937760" cy="3174274"/>
+            <wp:extent cx="4937760" cy="3138962"/>
             <wp:effectExtent b="0" l="0" r="0" t="0"/>
             <wp:docPr descr="Capacity: net Sharpe versus deployed AUM under square-root impact, for three impact coefficients." title="" id="19" name="Picture"/>
             <a:graphic>
@@ -716,7 +716,7 @@
                   <pic:spPr bwMode="auto">
                     <a:xfrm>
                       <a:off x="0" y="0"/>
-                      <a:ext cx="4937760" cy="3174274"/>
+                      <a:ext cx="4937760" cy="3138962"/>
                     </a:xfrm>
                     <a:prstGeom prst="rect">
                       <a:avLst/>
@@ -1062,7 +1062,7 @@
       <w:r>
         <w:drawing>
           <wp:inline>
-            <wp:extent cx="5303520" cy="2983230"/>
+            <wp:extent cx="5303520" cy="2948264"/>
             <wp:effectExtent b="0" l="0" r="0" t="0"/>
             <wp:docPr descr="Net equity (log scale, 7 bps), in-sample then out-of-sample. Strong early gains, a long plateau through the decay, and an out-of-sample decline." title="" id="27" name="Picture"/>
             <a:graphic>
@@ -1083,7 +1083,7 @@
                   <pic:spPr bwMode="auto">
                     <a:xfrm>
                       <a:off x="0" y="0"/>
-                      <a:ext cx="5303520" cy="2983230"/>
+                      <a:ext cx="5303520" cy="2948264"/>
                     </a:xfrm>
                     <a:prstGeom prst="rect">
                       <a:avLst/>

</xml_diff>

<commit_message>
memo: academic tone/style pass (Diebold register)
Rewrote the prose into a formal academic voice matching the reference paper:
declarative claims with precise hedging ("consistent with", "on the order of"),
fewer dashes-as-asides, less first-person editorializing (e.g. "the
specification is frozen" rather than "I deliberately stopped tuning"),
"this paper" framing, and formal section openers. All numbers, tables, figures,
and references unchanged; rebuilt docx + pdf (8 pp).
</commit_message>
<xml_diff>
--- a/reports/Equity_StatArb_Memo.docx
+++ b/reports/Equity_StatArb_Memo.docx
@@ -47,7 +47,7 @@
         <w:pStyle w:val="Abstract"/>
       </w:pPr>
       <w:r>
-        <w:t xml:space="preserve">I test whether short-horizon cross-sectional reversal in US equities survives a realistic, implementation-aware backtest. Using survivorship-bias-free CRSP daily data (2000–2024) and a deliberately leak-safe pipeline, I build the strategy up in stages — from a raw reversal baseline to a sector-residual signal with turnover control — and stress-test it for transaction costs, capacity, regime dependence, and out-of-sample stability. The signal is genuinely predictive and, after residualization and turnover control, is net-profitable in sample (Sharpe 0.34 after 7 bps costs; break-even cost 11.3 bps). But its edge has decayed steadily over the sample, it is capacity-constrained (roughly $10–100M), and on a single pre-registered out-of-sample test (2019–2024) it does not survive realistic costs (net Sharpe -0.15 at 7 bps; break-even 4.2 bps). The result is consistent with a crowded, cost-sensitive anomaly that has been largely arbitraged away, and the value of the work is the end-to-end methodology used to reach that conclusion rigorously.</w:t>
+        <w:t xml:space="preserve">This paper asks whether short-horizon cross-sectional reversal in US equities remains exploitable once implementation frictions are taken seriously. Using survivorship-bias-free CRSP daily data for 2000–2024 and a leak-safe backtest, I construct the strategy in stages, from a raw reversal baseline to a sector-residual signal with turnover control, and evaluate it under realistic transaction costs, capacity constraints, regime conditioning, and a single out-of-sample test. The signal is predictive, and after residualization and turnover control it is net-profitable in sample (Sharpe 0.34 net of 7 bps, with a break-even cost of 11.3 bps). Its edge nonetheless declines steadily across the sample, its capacity is limited (on the order of $10–100M), and on a pre-registered 2019–2024 holdout it no longer survives realistic costs (net Sharpe -0.15 at 7 bps; break-even 4.2 bps). The evidence is consistent with a crowded, cost-sensitive anomaly that has been largely arbitraged away. The contribution is primarily methodological: a transparent framework for assessing whether a documented anomaly remains economically viable after costs.</w:t>
       </w:r>
     </w:p>
     <w:bookmarkStart w:id="9" w:name="research-question"/>
@@ -64,7 +64,7 @@
         <w:pStyle w:val="FirstParagraph"/>
       </w:pPr>
       <w:r>
-        <w:t xml:space="preserve">Short-horizon reversal — the tendency for recent relative losers to outperform recent relative winners over days to weeks — is a long-documented effect (Lehmann, 1990; Lo and MacKinlay, 1990). The question that matters for a practitioner is not whether it appears in a frictionless backtest, but whether it remains economically meaningful once turnover, transaction costs, and capacity are taken seriously. This memo answers that question with an emphasis on methodology: every result is built to be defensible rather than optimized for a headline Sharpe.</w:t>
+        <w:t xml:space="preserve">Short-horizon reversal, the tendency for recent relative losers to outperform recent relative winners over horizons of days to weeks, is well documented (Lehmann, 1990; Lo and MacKinlay, 1990). For a practitioner the relevant question is not whether the effect is present in a frictionless backtest, but whether it remains economically meaningful once turnover, transaction costs, and capacity are accounted for. This paper addresses that question for liquid US equities, with an emphasis on methodological transparency: each result is constructed to withstand the standard objections rather than to maximize in-sample performance.</w:t>
       </w:r>
     </w:p>
     <w:bookmarkEnd w:id="9"/>
@@ -82,7 +82,7 @@
         <w:pStyle w:val="FirstParagraph"/>
       </w:pPr>
       <w:r>
-        <w:t xml:space="preserve">The sample is CRSP daily data for common shares (share codes 10–11) on NYSE, AMEX, and NASDAQ, January 2000 through December 2024 — 27.2 million name-days across 12,859 securities. CRSP is survivorship-bias-free and includes delisting returns, which matters because a reversal book is drawn toward distressed names. Two data choices do most of the work:</w:t>
+        <w:t xml:space="preserve">The sample consists of CRSP daily data for common shares (share codes 10–11) listed on the NYSE, AMEX, and NASDAQ over January 2000 through December 2024, comprising 27.2 million name-days across 12,859 securities. CRSP is survivorship-bias-free and records delisting returns, which is material here because a reversal strategy tends to accumulate positions in distressed names. Two features of the data construction are central.</w:t>
       </w:r>
     </w:p>
     <w:p>
@@ -104,7 +104,7 @@
         <w:t xml:space="preserve"> </w:t>
       </w:r>
       <w:r>
-        <w:t xml:space="preserve">44.5% of delisting events have a missing return in CRSP. Following Shumway (1997), missing returns on performance-related delistings are set to -30% rather than zero, so failed names are not quietly recorded as flat exits.</w:t>
+        <w:t xml:space="preserve">Delisting returns are missing for 44.5% of delisting events. Following Shumway (1997), missing returns on performance-related delistings are set to -30% rather than zero, so that failed firms are not recorded as costless exits.</w:t>
       </w:r>
     </w:p>
     <w:p>
@@ -120,13 +120,13 @@
           <w:b/>
           <w:bCs/>
         </w:rPr>
-        <w:t xml:space="preserve">Separation of PnL from tradability.</w:t>
-      </w:r>
-      <w:r>
-        <w:t xml:space="preserve"> </w:t>
-      </w:r>
-      <w:r>
-        <w:t xml:space="preserve">The backtest keeps two distinct panels: a realized-return panel (never masked) for computing PnL, and a lagged eligibility mask (top-1,000 by trailing dollar volume, prior-close price</w:t>
+        <w:t xml:space="preserve">Separation of return measurement from tradability.</w:t>
+      </w:r>
+      <w:r>
+        <w:t xml:space="preserve"> </w:t>
+      </w:r>
+      <w:r>
+        <w:t xml:space="preserve">The backtest maintains two distinct panels: a realized-return panel, used to compute PnL and never masked, and a lagged eligibility mask (the top 1,000 names by trailing dollar volume, with prior-close price</w:t>
       </w:r>
       <w:r>
         <w:t xml:space="preserve"> </w:t>
@@ -143,7 +143,7 @@
         <w:t xml:space="preserve"> </w:t>
       </w:r>
       <w:r>
-        <w:t xml:space="preserve">$5, delisting rows excluded) that only governs which names may receive new weight. This prevents the most common silent leak, in which a position that becomes ineligible disappears from PnL instead of realizing its loss.</w:t>
+        <w:t xml:space="preserve">$5 and delisting rows excluded) that governs only which names may receive new weight. This separation prevents a common contamination in which a position that loses eligibility is dropped from the return calculation rather than realizing its terminal loss.</w:t>
       </w:r>
     </w:p>
     <w:p>
@@ -151,7 +151,7 @@
         <w:pStyle w:val="FirstParagraph"/>
       </w:pPr>
       <w:r>
-        <w:t xml:space="preserve">Weights are formed at each day’s close and shifted one day before earning returns, so the strategy only ever uses information available at decision time. A test suite (28 tests) guards the metrics and the look-ahead and disappearing-loser leaks.</w:t>
+        <w:t xml:space="preserve">Weights are formed at each day’s close and lagged one day before they earn returns, so that the strategy conditions only on information available at the decision time. A suite of 28 unit tests guards the performance metrics and the look-ahead and disappearing-position safeguards.</w:t>
       </w:r>
     </w:p>
     <w:bookmarkEnd w:id="10"/>
@@ -181,7 +181,7 @@
         <w:t xml:space="preserve">The base signal is the negative of each name’s trailing five-day return, winsorized at $</w:t>
       </w:r>
       <w:r>
-        <w:t xml:space="preserve">$20% for signal formation only (never for realized PnL). I then remove common variation before measuring reversal, in two escalating steps: a market residual (rolling beta to the equal-weighted eligible universe), and a leave-one-out sector residual (demeaning within two-digit SIC industry against eligible peers, excluding the name itself so it cannot anchor its own benchmark). Residualizing targets idiosyncratic reversal rather than sector or market co-movement.</w:t>
+        <w:t xml:space="preserve">$20% for signal construction only and never for realized PnL. Common variation is removed before reversal is measured, in two steps of increasing stringency. The first is a market residual, obtained from a rolling regression on the equal-weighted eligible universe. The second is a leave-one-out sector residual, formed by demeaning within two-digit SIC industry against eligible peers while excluding the name itself, so that a security does not anchor its own benchmark. Residualization isolates idiosyncratic reversal from sector- and market-level co-movement.</w:t>
       </w:r>
     </w:p>
     <w:bookmarkEnd w:id="11"/>
@@ -199,7 +199,7 @@
         <w:pStyle w:val="FirstParagraph"/>
       </w:pPr>
       <w:r>
-        <w:t xml:space="preserve">Signals map to dollar-neutral, cross-sectionally demeaned weights with a 2% per-name cap. Because daily five-day reversal turns the book over quickly, I apply exponentially-weighted smoothing (half-life of five days) to the signal. This is the single most important implementation choice, trading a small amount of gross edge for a large reduction in turnover. The frozen candidate is: sector-residual five-day reversal, EWMA half-life 5, top-1,000 universe, 7 bps per-turnover cost.</w:t>
+        <w:t xml:space="preserve">Signals are mapped to dollar-neutral, cross-sectionally demeaned weights subject to a 2% per-name cap. Because daily five-day reversal generates high turnover, the signal is smoothed with an exponentially weighted moving average with a five-day half-life. Smoothing exchanges a modest reduction in gross signal strength for a substantial reduction in turnover, and proves decisive for net performance. The resulting specification, fixed for all subsequent tests, is a sector-residual five-day reversal signal with an EWMA half-life of five days, a top-1,000 universe, and a 7 bps per-turnover cost.</w:t>
       </w:r>
     </w:p>
     <w:bookmarkEnd w:id="12"/>
@@ -218,7 +218,7 @@
         <w:pStyle w:val="FirstParagraph"/>
       </w:pPr>
       <w:r>
-        <w:t xml:space="preserve">Each layer of construction raises the per-trade edge, summarized by the break-even cost (the cost per unit turnover at which net return is zero).</w:t>
+        <w:t xml:space="preserve">Each stage of construction raises the per-trade edge, summarized by the break-even cost, defined as the cost per unit turnover at which net return is zero.</w:t>
       </w:r>
     </w:p>
     <w:p>
@@ -506,7 +506,7 @@
         <w:pStyle w:val="BodyText"/>
       </w:pPr>
       <w:r>
-        <w:t xml:space="preserve">Residualization lifts break-even from 4.4 to 5.5 bps; turnover control then roughly halves turnover and doubles break-even to 11.3 bps, flipping the strategy net-positive at a 7 bps cost (net Sharpe 0.34, ~2.2% annualized). I deliberately stopped tuning here and froze the specification before any out-of-sample evaluation.</w:t>
+        <w:t xml:space="preserve">Residualization raises break-even from 4.4 to 5.5 bps; turnover control then approximately halves turnover and roughly doubles break-even, to 11.3 bps, rendering the strategy net-profitable at a 7 bps cost (net Sharpe 0.34, approximately 2.2% annualized). The specification is frozen at this point, prior to any out-of-sample evaluation.</w:t>
       </w:r>
     </w:p>
     <w:bookmarkEnd w:id="14"/>
@@ -524,7 +524,7 @@
         <w:pStyle w:val="FirstParagraph"/>
       </w:pPr>
       <w:r>
-        <w:t xml:space="preserve">Because the strategy’s viability rests on implementation, the cost and capacity analysis is treated as central rather than an afterthought. Net Sharpe falls roughly linearly with assumed cost, crossing zero near the 11.3 bps break-even (Figure 1).</w:t>
+        <w:t xml:space="preserve">Because the strategy’s viability depends on implementation, the cost and capacity analysis is central to what follows. Net Sharpe declines approximately linearly in the assumed cost, reaching zero near the 11.3 bps break-even (Figure 1).</w:t>
       </w:r>
     </w:p>
     <w:p>
@@ -536,7 +536,7 @@
           <wp:inline>
             <wp:extent cx="4937760" cy="3144918"/>
             <wp:effectExtent b="0" l="0" r="0" t="0"/>
-            <wp:docPr descr="In-sample net Sharpe versus assumed per-turnover cost. Net-positive up to the ~11.3 bps break-even; about 0.08 Sharpe lost per bp." title="" id="16" name="Picture"/>
+            <wp:docPr descr="In-sample net Sharpe as a function of the assumed per-turnover cost. The strategy is net-positive up to the 11.3 bps break-even, losing approximately 0.08 in Sharpe per basis point." title="" id="16" name="Picture"/>
             <a:graphic>
               <a:graphicData uri="http://schemas.openxmlformats.org/drawingml/2006/picture">
                 <pic:pic>
@@ -579,7 +579,7 @@
         <w:pStyle w:val="ImageCaption"/>
       </w:pPr>
       <w:r>
-        <w:t xml:space="preserve">In-sample net Sharpe versus assumed per-turnover cost. Net-positive up to the ~11.3 bps break-even; about 0.08 Sharpe lost per bp.</w:t>
+        <w:t xml:space="preserve">In-sample net Sharpe as a function of the assumed per-turnover cost. The strategy is net-positive up to the 11.3 bps break-even, losing approximately 0.08 in Sharpe per basis point.</w:t>
       </w:r>
     </w:p>
     <w:p>
@@ -587,7 +587,7 @@
         <w:pStyle w:val="BodyText"/>
       </w:pPr>
       <w:r>
-        <w:t xml:space="preserve">Capacity uses a square-root market-impact model,</w:t>
+        <w:t xml:space="preserve">Capacity is assessed under a square-root market-impact model,</w:t>
       </w:r>
       <w:r>
         <w:t xml:space="preserve"> </w:t>
@@ -654,10 +654,7 @@
         </m:rad>
       </m:oMath>
       <w:r>
-        <w:t xml:space="preserve"> </w:t>
-      </w:r>
-      <w:r>
-        <w:t xml:space="preserve">— a standard practitioner approximation (Almgren et al., 2005; Tóth et al., 2011) — with the coefficient</w:t>
+        <w:t xml:space="preserve">, a standard approximation (Almgren et al., 2005; Tóth et al., 2011), with the coefficient</w:t>
       </w:r>
       <w:r>
         <w:t xml:space="preserve"> </w:t>
@@ -671,7 +668,7 @@
         <w:t xml:space="preserve"> </w:t>
       </w:r>
       <w:r>
-        <w:t xml:space="preserve">shown across a plausible range rather than assumed. Usable capacity is modest, roughly $10–100M depending on</w:t>
+        <w:t xml:space="preserve">reported across a plausible range rather than fixed at a single value. Usable capacity is modest, on the order of $10–100M depending on</w:t>
       </w:r>
       <w:r>
         <w:t xml:space="preserve"> </w:t>
@@ -685,7 +682,7 @@
         <w:t xml:space="preserve"> </w:t>
       </w:r>
       <w:r>
-        <w:t xml:space="preserve">(Figure 2). The binding constraint is not average liquidity but a thin-name tail: at $1B of capital the largest single-name participation reaches multiples of daily volume. A position cap at a fraction of ADV controls that tail and limits the damage at scale, but does not extend the profitable frontier; it is a risk control, not a capacity unlock.</w:t>
+        <w:t xml:space="preserve">(Figure 2). The binding constraint is not average liquidity but a thin-name tail: at $1B of deployed capital, the largest single-name participation reaches several multiples of daily volume. Capping positions at a fraction of ADV controls this tail and limits the deterioration at scale, but does not extend the profitable frontier; it functions as a risk control rather than a means of expanding capacity.</w:t>
       </w:r>
     </w:p>
     <w:p>
@@ -697,7 +694,7 @@
           <wp:inline>
             <wp:extent cx="4937760" cy="3138962"/>
             <wp:effectExtent b="0" l="0" r="0" t="0"/>
-            <wp:docPr descr="Capacity: net Sharpe versus deployed AUM under square-root impact, for three impact coefficients." title="" id="19" name="Picture"/>
+            <wp:docPr descr="Net Sharpe as a function of deployed AUM under a square-root market-impact model, for three impact coefficients." title="" id="19" name="Picture"/>
             <a:graphic>
               <a:graphicData uri="http://schemas.openxmlformats.org/drawingml/2006/picture">
                 <pic:pic>
@@ -740,7 +737,7 @@
         <w:pStyle w:val="ImageCaption"/>
       </w:pPr>
       <w:r>
-        <w:t xml:space="preserve">Capacity: net Sharpe versus deployed AUM under square-root impact, for three impact coefficients.</w:t>
+        <w:t xml:space="preserve">Net Sharpe as a function of deployed AUM under a square-root market-impact model, for three impact coefficients.</w:t>
       </w:r>
     </w:p>
     <w:bookmarkEnd w:id="21"/>
@@ -767,7 +764,7 @@
         <w:pStyle w:val="FirstParagraph"/>
       </w:pPr>
       <w:r>
-        <w:t xml:space="preserve">Split into three in-sample sub-periods, break-even falls monotonically: 17.6 bps (2000–2006), 8.0 bps (2007–2012), 6.9 bps (2013–2018). Because break-even is independent of the assumed cost level, this is genuine decay in the per-trade edge — consistent with crowding, decimalization, and tighter markets — not an artifact of the cost assumption. By 2013–2018 the strategy is profitable only if one executes below roughly 5 bps.</w:t>
+        <w:t xml:space="preserve">Partitioning the in-sample period into three sub-periods, break-even declines monotonically: 17.6 bps over 2000–2006, 8.0 bps over 2007–2012, and 6.9 bps over 2013–2018. Because break-even is invariant to the assumed cost level, this represents genuine decay in the per-trade edge, consistent with increased crowding, decimalization, and tighter markets, rather than an artifact of the cost assumption. By 2013–2018 the strategy is profitable only at execution costs below roughly 5 bps.</w:t>
       </w:r>
     </w:p>
     <w:bookmarkEnd w:id="22"/>
@@ -785,7 +782,7 @@
         <w:pStyle w:val="FirstParagraph"/>
       </w:pPr>
       <w:r>
-        <w:t xml:space="preserve">After removing market exposure, the alpha is concentrated on the short side (information ratio 1.37 for shorting residual winners versus 0.18 for buying residual losers); the long leg’s raw return is mostly market beta. The profitable short positions concentrate in low-price names ($5–25), which are precisely the names that are more expensive and harder to borrow. PnL is otherwise broad — the top ten names account for only about 8% of gross profit, and 2,356 names contribute positively — so the result is not a handful of lucky stocks, though it leans toward technology sectors.</w:t>
+        <w:t xml:space="preserve">After market exposure is removed, the alpha is concentrated on the short side: the information ratio is 1.37 for shorting residual winners against 0.18 for buying residual losers, and the long leg’s raw return is largely market beta. The profitable short positions are concentrated in low-price securities ($5–25), which tend to be the most expensive and difficult to borrow. PnL is otherwise broadly distributed; the ten largest contributors account for roughly 8% of gross profit and 2,356 names contribute positively, indicating that the result does not derive from a small number of outlier securities, although it exhibits a tilt toward technology sectors.</w:t>
       </w:r>
     </w:p>
     <w:bookmarkEnd w:id="23"/>
@@ -803,7 +800,7 @@
         <w:pStyle w:val="FirstParagraph"/>
       </w:pPr>
       <w:r>
-        <w:t xml:space="preserve">Conditioning returns on the market environment shows the edge is concentrated in high-volatility and high-dispersion regimes, where dislocations are larger; the strategy is paid to provide liquidity into those dislocations. Its worst stretches are revealing: the deepest drawdown is a long, slow grind through the calm 2003–2007 bull market, and the worst individual months are momentum extremes in both directions (the 2000 dot-com blow-off and the 2009 rebound), not selloffs per se. The honest characterization is short momentum / long reversion with a liquidity-provision profile: it earns when dislocations mean-revert and suffers when trends persist.</w:t>
+        <w:t xml:space="preserve">Conditioning returns on the market environment shows that the edge is concentrated in high-volatility and high-dispersion regimes, in which dislocations are larger; the strategy is compensated for supplying liquidity into such dislocations. Its worst episodes are informative. The deepest drawdown occurs during the comparatively calm 2003–2007 bull market, and the worst individual months are momentum extremes in both directions, the 2000 dot-com peak and the 2009 rebound, rather than selloffs as such. The strategy is therefore best characterized as short momentum and long reversion with a liquidity-provision profile: it profits when dislocations mean-revert and loses when trends persist.</w:t>
       </w:r>
     </w:p>
     <w:bookmarkEnd w:id="24"/>
@@ -822,7 +819,7 @@
         <w:pStyle w:val="FirstParagraph"/>
       </w:pPr>
       <w:r>
-        <w:t xml:space="preserve">The frozen candidate was evaluated once on the sealed 2019–2024 period, with no parameters chosen after looking. The edge does not survive (Table 2, Figure 3).</w:t>
+        <w:t xml:space="preserve">The frozen specification is evaluated once on the sealed 2019–2024 period, with no parameters adjusted after the holdout is observed. The edge does not survive (Table 2, Figure 3).</w:t>
       </w:r>
     </w:p>
     <w:p>
@@ -1052,7 +1049,7 @@
         <w:pStyle w:val="BodyText"/>
       </w:pPr>
       <w:r>
-        <w:t xml:space="preserve">Break-even continues its decline to 4.2 bps, below the realistic cost line; net Sharpe is positive only at an unrealistic ~2 bps. The largest out-of-sample drawdown coincides with the 2020 COVID crash and rebound — the violent-momentum regime the diagnostics predicted would hurt. A deflated Sharpe ratio on the in-sample result, accounting for the twelve configurations evaluated, gives only a 0.20 probability that the true Sharpe is positive: even the in-sample edge is statistically fragile once selection is accounted for.</w:t>
+        <w:t xml:space="preserve">Break-even continues to decline, to 4.2 bps, below any realistic cost, and net Sharpe is positive only at an implausible 2 bps. The largest out-of-sample drawdown coincides with the 2020 COVID crash and subsequent rebound, a violent-momentum regime of the kind the in-sample diagnostics identify as adverse. A deflated Sharpe ratio computed on the in-sample result, accounting for the twelve specifications examined, assigns only a 0.20 probability that the true Sharpe is positive; the in-sample edge is therefore statistically fragile once selection is taken into account.</w:t>
       </w:r>
     </w:p>
     <w:p>
@@ -1064,7 +1061,7 @@
           <wp:inline>
             <wp:extent cx="5303520" cy="2948264"/>
             <wp:effectExtent b="0" l="0" r="0" t="0"/>
-            <wp:docPr descr="Net equity (log scale, 7 bps), in-sample then out-of-sample. Strong early gains, a long plateau through the decay, and an out-of-sample decline." title="" id="27" name="Picture"/>
+            <wp:docPr descr="Net equity (log scale, 7 bps cost) over the full sample, in-sample followed by out-of-sample. Strong early gains give way to a long plateau and an out-of-sample decline." title="" id="27" name="Picture"/>
             <a:graphic>
               <a:graphicData uri="http://schemas.openxmlformats.org/drawingml/2006/picture">
                 <pic:pic>
@@ -1107,7 +1104,7 @@
         <w:pStyle w:val="ImageCaption"/>
       </w:pPr>
       <w:r>
-        <w:t xml:space="preserve">Net equity (log scale, 7 bps), in-sample then out-of-sample. Strong early gains, a long plateau through the decay, and an out-of-sample decline.</w:t>
+        <w:t xml:space="preserve">Net equity (log scale, 7 bps cost) over the full sample, in-sample followed by out-of-sample. Strong early gains give way to a long plateau and an out-of-sample decline.</w:t>
       </w:r>
     </w:p>
     <w:bookmarkEnd w:id="29"/>
@@ -1125,7 +1122,7 @@
         <w:pStyle w:val="FirstParagraph"/>
       </w:pPr>
       <w:r>
-        <w:t xml:space="preserve">Short-horizon residual reversal was a strong, real effect in the early 2000s that has decayed below tradable levels: by the out-of-sample period it no longer clears realistic costs, its capacity is small, and its remaining alpha sits on the expensive-to-borrow short side. This is the expected life cycle of a well-known, crowded anomaly. The deliverable is the method — a leak-safe pipeline, a transparent construction ladder, an execution and capacity layer, regime and attribution diagnostics, a pre-registered specification, and a single honest out-of-sample test — which is what makes the negative conclusion trustworthy.</w:t>
+        <w:t xml:space="preserve">Short-horizon residual reversal was a strong effect in the early 2000s that has since decayed below tradable levels: by the out-of-sample period it no longer clears realistic costs, its capacity is limited, and its residual alpha lies on the expensive-to-borrow short side. This pattern is consistent with the typical life cycle of a widely known, crowded anomaly. The principal contribution of the paper is methodological. A leak-safe data pipeline, a transparent construction sequence, an execution and capacity layer, regime and attribution diagnostics, a pre-registered specification, and a single out-of-sample test together make the negative conclusion credible.</w:t>
       </w:r>
     </w:p>
     <w:bookmarkStart w:id="30" w:name="limitations-and-future-work"/>
@@ -1146,7 +1143,7 @@
         </w:numPr>
       </w:pPr>
       <w:r>
-        <w:t xml:space="preserve">Costs are a flat 7 bps headline with 2–10 bps sensitivity; the impact coefficient is uncertain and shown as a range. Short borrow is not modeled, which matters given the short-side, low-price concentration of the alpha.</w:t>
+        <w:t xml:space="preserve">Transaction costs are summarized by a flat 7 bps headline assumption, with sensitivity reported over 2–10 bps; the market-impact coefficient is uncertain and is presented as a range. Short-borrow costs are not modeled, which is a material omission given the short-side, low-price concentration of the alpha.</w:t>
       </w:r>
     </w:p>
     <w:p>
@@ -1158,7 +1155,7 @@
         </w:numPr>
       </w:pPr>
       <w:r>
-        <w:t xml:space="preserve">Daily data makes this execution-aware, not intraday; a natural extension is TAQ / limit-order-book data and a true path-dependent participation cap.</w:t>
+        <w:t xml:space="preserve">Because the analysis uses daily data, it is execution-aware rather than intraday; a natural extension would employ TAQ or limit-order-book data and a path-dependent participation cap.</w:t>
       </w:r>
     </w:p>
     <w:p>
@@ -1170,7 +1167,7 @@
         </w:numPr>
       </w:pPr>
       <w:r>
-        <w:t xml:space="preserve">Further extensions: PCA / Ornstein–Uhlenbeck residuals (Avellaneda and Lee, 2010), explicit borrow-cost modeling, and external macro conditioning (VIX, the yield-curve slope, recession dating).</w:t>
+        <w:t xml:space="preserve">Further extensions include PCA and Ornstein–Uhlenbeck residuals (Avellaneda and Lee, 2010), explicit modeling of borrowing costs, and conditioning on external macroeconomic variables such as the VIX, the slope of the yield curve, and recession indicators.</w:t>
       </w:r>
     </w:p>
     <w:bookmarkEnd w:id="30"/>

</xml_diff>

<commit_message>
figure 2 (capacity): black/red/blue lines, no markers
- capacity.py: explicit colors (eta 0.3/0.6/1.0 -> black/red/blue), removed the
  "o" point markers (solid lines). Regenerated capacity.png; rebuilt docx + pdf.
</commit_message>
<xml_diff>
--- a/reports/Equity_StatArb_Memo.docx
+++ b/reports/Equity_StatArb_Memo.docx
@@ -692,7 +692,7 @@
       <w:r>
         <w:drawing>
           <wp:inline>
-            <wp:extent cx="4937760" cy="3138962"/>
+            <wp:extent cx="4937760" cy="3156830"/>
             <wp:effectExtent b="0" l="0" r="0" t="0"/>
             <wp:docPr descr="Net Sharpe as a function of deployed AUM under a square-root market-impact model, for three impact coefficients." title="" id="19" name="Picture"/>
             <a:graphic>
@@ -713,7 +713,7 @@
                   <pic:spPr bwMode="auto">
                     <a:xfrm>
                       <a:off x="0" y="0"/>
-                      <a:ext cx="4937760" cy="3138962"/>
+                      <a:ext cx="4937760" cy="3156830"/>
                     </a:xfrm>
                     <a:prstGeom prst="rect">
                       <a:avLst/>

</xml_diff>